<commit_message>
Add optional pay-to-play and one-round-only alternatives to the participation right
Investment Agreement: bracketed Section 5.4(e) (Alternative 1, pay-to-play
limited to the participation right) and 5.4(f) (Alternative 2, one round
only); Qualified Financing Threshold row in the Deal Terms table; Section
8.9(b) safe harbor for a proportional majority waiver of Section 5.4;
expanded drafting note. Term Sheet, Variable Reference Map and README
conformed. Word files rebuilt.

Co-Authored-By: Claude Fable 5.1 <noreply@anthropic.com>
Claude-Session: https://claude.ai/code/session_019h9WziB45mKyE1HwSD4FBh
</commit_message>
<xml_diff>
--- a/docx/Series Seed - Stock Investment Agreement.docx
+++ b/docx/Series Seed - Stock Investment Agreement.docx
@@ -1179,7 +1179,100 @@
                 <w:sz w:val="22"/>
                 <w:szCs w:val="22"/>
               </w:rPr>
-              <w:t xml:space="preserve">Sections 2.5, 5.1, 5.2, 5.4, 6.2, 8.2</w:t>
+              <w:t xml:space="preserve">Sections 2.5, 5.1, 5.2, 5.4, 6.2, 8.2, 8.9</w:t>
+            </w:r>
+          </w:p>
+        </w:tc>
+      </w:tr>
+      <w:tr>
+        <w:trPr>
+          <w:cantSplit/>
+          <w:tblHeader w:val="false"/>
+        </w:trPr>
+        <w:tc>
+          <w:tcPr>
+            <w:tcW w:type="dxa" w:w="2100"/>
+            <w:tcMar>
+              <w:top w:type="dxa" w:w="60"/>
+              <w:left w:type="dxa" w:w="100"/>
+              <w:bottom w:type="dxa" w:w="60"/>
+              <w:right w:type="dxa" w:w="100"/>
+            </w:tcMar>
+          </w:tcPr>
+          <w:p>
+            <w:pPr>
+              <w:spacing w:after="0" w:before="0"/>
+            </w:pPr>
+            <w:r>
+              <w:rPr>
+                <w:rFonts w:ascii="Calibri" w:cs="Calibri" w:eastAsia="Calibri" w:hAnsi="Calibri"/>
+                <w:b/>
+                <w:bCs/>
+                <w:i w:val="false"/>
+                <w:iCs w:val="false"/>
+                <w:caps w:val="false"/>
+                <w:sz w:val="22"/>
+                <w:szCs w:val="22"/>
+              </w:rPr>
+              <w:t xml:space="preserve">[Qualified Financing Threshold]</w:t>
+            </w:r>
+          </w:p>
+        </w:tc>
+        <w:tc>
+          <w:tcPr>
+            <w:tcW w:type="dxa" w:w="4560"/>
+            <w:tcMar>
+              <w:top w:type="dxa" w:w="60"/>
+              <w:left w:type="dxa" w:w="100"/>
+              <w:bottom w:type="dxa" w:w="60"/>
+              <w:right w:type="dxa" w:w="100"/>
+            </w:tcMar>
+          </w:tcPr>
+          <w:p>
+            <w:pPr>
+              <w:spacing w:after="0" w:before="0"/>
+            </w:pPr>
+            <w:r>
+              <w:rPr>
+                <w:rFonts w:ascii="Calibri" w:cs="Calibri" w:eastAsia="Calibri" w:hAnsi="Calibri"/>
+                <w:b w:val="false"/>
+                <w:bCs w:val="false"/>
+                <w:i w:val="false"/>
+                <w:iCs w:val="false"/>
+                <w:caps w:val="false"/>
+                <w:sz w:val="22"/>
+                <w:szCs w:val="22"/>
+              </w:rPr>
+              <w:t xml:space="preserve">[$[______]]</w:t>
+            </w:r>
+          </w:p>
+        </w:tc>
+        <w:tc>
+          <w:tcPr>
+            <w:tcW w:type="dxa" w:w="2700"/>
+            <w:tcMar>
+              <w:top w:type="dxa" w:w="60"/>
+              <w:left w:type="dxa" w:w="100"/>
+              <w:bottom w:type="dxa" w:w="60"/>
+              <w:right w:type="dxa" w:w="100"/>
+            </w:tcMar>
+          </w:tcPr>
+          <w:p>
+            <w:pPr>
+              <w:spacing w:after="0" w:before="0"/>
+            </w:pPr>
+            <w:r>
+              <w:rPr>
+                <w:rFonts w:ascii="Calibri" w:cs="Calibri" w:eastAsia="Calibri" w:hAnsi="Calibri"/>
+                <w:b w:val="false"/>
+                <w:bCs w:val="false"/>
+                <w:i w:val="false"/>
+                <w:iCs w:val="false"/>
+                <w:caps w:val="false"/>
+                <w:sz w:val="22"/>
+                <w:szCs w:val="22"/>
+              </w:rPr>
+              <w:t xml:space="preserve">Section 5.4(e)</w:t>
             </w:r>
           </w:p>
         </w:tc>
@@ -5797,18 +5890,18 @@
     <w:p>
       <w:pPr>
         <w:tabs>
-          <w:tab w:val="left" w:pos="720"/>
+          <w:tab w:val="left" w:pos="1440"/>
         </w:tabs>
         <w:spacing w:after="200" w:before="0"/>
-        <w:ind w:left="0" w:firstLine="0"/>
-      </w:pPr>
-      <w:r>
-        <w:rPr>
-          <w:rFonts w:ascii="Calibri" w:cs="Calibri" w:eastAsia="Calibri" w:hAnsi="Calibri"/>
-          <w:sz w:val="22"/>
-          <w:szCs w:val="22"/>
-        </w:rPr>
-        <w:t xml:space="preserve">5.5</w:t>
+        <w:ind w:left="0" w:firstLine="720"/>
+      </w:pPr>
+      <w:r>
+        <w:rPr>
+          <w:rFonts w:ascii="Calibri" w:cs="Calibri" w:eastAsia="Calibri" w:hAnsi="Calibri"/>
+          <w:sz w:val="22"/>
+          <w:szCs w:val="22"/>
+        </w:rPr>
+        <w:t xml:space="preserve">(e)</w:t>
       </w:r>
       <w:r>
         <w:rPr>
@@ -5821,26 +5914,41 @@
       <w:r>
         <w:rPr>
           <w:rFonts w:ascii="Calibri" w:cs="Calibri" w:eastAsia="Calibri" w:hAnsi="Calibri"/>
-          <w:b/>
-          <w:bCs/>
-          <w:sz w:val="22"/>
-          <w:szCs w:val="22"/>
-        </w:rPr>
-        <w:t xml:space="preserve">Next Financing; Most Favored Nation.</w:t>
-      </w:r>
-      <w:r>
-        <w:rPr>
-          <w:rFonts w:ascii="Calibri" w:cs="Calibri" w:eastAsia="Calibri" w:hAnsi="Calibri"/>
-          <w:sz w:val="22"/>
-          <w:szCs w:val="22"/>
-        </w:rPr>
-        <w:t xml:space="preserve"> </w:t>
-      </w:r>
-      <w:r>
-        <w:rPr>
-          <w:rStyle w:val="FootnoteReference"/>
-        </w:rPr>
-        <w:footnoteReference w:id="11"/>
+          <w:b w:val="false"/>
+          <w:bCs w:val="false"/>
+          <w:i w:val="false"/>
+          <w:iCs w:val="false"/>
+          <w:caps w:val="false"/>
+          <w:sz w:val="22"/>
+          <w:szCs w:val="22"/>
+        </w:rPr>
+        <w:t xml:space="preserve">[Alternative 1: If the Company closes a Qualified Financing after offering a Major Purchaser the opportunity to purchase New Securities in it under this Section 5.4 or Section 8.9(b), and the Major Purchaser and its Affiliates have not, at that closing, purchased at least [the Major Purchaser’s full Pro Rata Share] [[50]% of the Major Purchaser’s Pro Rata Share] of the New Securities offered (or, if less, the full amount they were permitted to purchase after any waiver under Section 8.9), the Major Purchaser and any transferee of its Shares cease to have any right under this Section 5.4 with respect to later offerings of New Securities and are not entitled under Section 5.5 to a participation right under the Next Financing Documents, but the Major Purchaser remains a Major Purchaser for all other purposes of this Agreement. A “</w:t>
+      </w:r>
+      <w:r>
+        <w:rPr>
+          <w:rFonts w:ascii="Calibri" w:cs="Calibri" w:eastAsia="Calibri" w:hAnsi="Calibri"/>
+          <w:b/>
+          <w:bCs/>
+          <w:i w:val="false"/>
+          <w:iCs w:val="false"/>
+          <w:caps w:val="false"/>
+          <w:sz w:val="22"/>
+          <w:szCs w:val="22"/>
+        </w:rPr>
+        <w:t xml:space="preserve">Qualified Financing</w:t>
+      </w:r>
+      <w:r>
+        <w:rPr>
+          <w:rFonts w:ascii="Calibri" w:cs="Calibri" w:eastAsia="Calibri" w:hAnsi="Calibri"/>
+          <w:b w:val="false"/>
+          <w:bCs w:val="false"/>
+          <w:i w:val="false"/>
+          <w:iCs w:val="false"/>
+          <w:caps w:val="false"/>
+          <w:sz w:val="22"/>
+          <w:szCs w:val="22"/>
+        </w:rPr>
+        <w:t xml:space="preserve">” is a bona fide equity financing of the Company for capital-raising purposes[, in which a Person that is not a Major Purchaser or an Affiliate of a Major Purchaser purchases at least [a majority] of the New Securities sold,] with aggregate gross cash proceeds to the Company of at least the Qualified Financing Threshold. This Section 5.4(e) does not apply to a Major Purchaser that was prohibited by applicable law from purchasing the New Securities.]</w:t>
       </w:r>
     </w:p>
     <w:p>
@@ -5857,7 +5965,7 @@
           <w:sz w:val="22"/>
           <w:szCs w:val="22"/>
         </w:rPr>
-        <w:t xml:space="preserve">(a)</w:t>
+        <w:t xml:space="preserve">(f)</w:t>
       </w:r>
       <w:r>
         <w:rPr>
@@ -5870,12 +5978,50 @@
       <w:r>
         <w:rPr>
           <w:rFonts w:ascii="Calibri" w:cs="Calibri" w:eastAsia="Calibri" w:hAnsi="Calibri"/>
-          <w:b/>
-          <w:bCs/>
-          <w:sz w:val="22"/>
-          <w:szCs w:val="22"/>
-        </w:rPr>
-        <w:t xml:space="preserve">Definitions.</w:t>
+          <w:b w:val="false"/>
+          <w:bCs w:val="false"/>
+          <w:i w:val="false"/>
+          <w:iCs w:val="false"/>
+          <w:caps w:val="false"/>
+          <w:sz w:val="22"/>
+          <w:szCs w:val="22"/>
+        </w:rPr>
+        <w:t xml:space="preserve">[Alternative 2: The rights in this Section 5.4 terminate upon the initial closing of the Next Financing (as defined in Section 5.5(a)), and no Purchaser is entitled under Section 5.5 to a participation right under the Next Financing Documents.]</w:t>
+      </w:r>
+    </w:p>
+    <w:p>
+      <w:pPr>
+        <w:tabs>
+          <w:tab w:val="left" w:pos="720"/>
+        </w:tabs>
+        <w:spacing w:after="200" w:before="0"/>
+        <w:ind w:left="0" w:firstLine="0"/>
+      </w:pPr>
+      <w:r>
+        <w:rPr>
+          <w:rFonts w:ascii="Calibri" w:cs="Calibri" w:eastAsia="Calibri" w:hAnsi="Calibri"/>
+          <w:sz w:val="22"/>
+          <w:szCs w:val="22"/>
+        </w:rPr>
+        <w:t xml:space="preserve">5.5</w:t>
+      </w:r>
+      <w:r>
+        <w:rPr>
+          <w:rFonts w:ascii="Calibri" w:cs="Calibri" w:eastAsia="Calibri" w:hAnsi="Calibri"/>
+          <w:sz w:val="22"/>
+          <w:szCs w:val="22"/>
+        </w:rPr>
+        <w:t xml:space="preserve">	</w:t>
+      </w:r>
+      <w:r>
+        <w:rPr>
+          <w:rFonts w:ascii="Calibri" w:cs="Calibri" w:eastAsia="Calibri" w:hAnsi="Calibri"/>
+          <w:b/>
+          <w:bCs/>
+          <w:sz w:val="22"/>
+          <w:szCs w:val="22"/>
+        </w:rPr>
+        <w:t xml:space="preserve">Next Financing; Most Favored Nation.</w:t>
       </w:r>
       <w:r>
         <w:rPr>
@@ -5887,120 +6033,9 @@
       </w:r>
       <w:r>
         <w:rPr>
-          <w:rFonts w:ascii="Calibri" w:cs="Calibri" w:eastAsia="Calibri" w:hAnsi="Calibri"/>
-          <w:b w:val="false"/>
-          <w:bCs w:val="false"/>
-          <w:i w:val="false"/>
-          <w:iCs w:val="false"/>
-          <w:caps w:val="false"/>
-          <w:sz w:val="22"/>
-          <w:szCs w:val="22"/>
-        </w:rPr>
-        <w:t xml:space="preserve">The “</w:t>
-      </w:r>
-      <w:r>
-        <w:rPr>
-          <w:rFonts w:ascii="Calibri" w:cs="Calibri" w:eastAsia="Calibri" w:hAnsi="Calibri"/>
-          <w:b/>
-          <w:bCs/>
-          <w:i w:val="false"/>
-          <w:iCs w:val="false"/>
-          <w:caps w:val="false"/>
-          <w:sz w:val="22"/>
-          <w:szCs w:val="22"/>
-        </w:rPr>
-        <w:t xml:space="preserve">Next Financing</w:t>
-      </w:r>
-      <w:r>
-        <w:rPr>
-          <w:rFonts w:ascii="Calibri" w:cs="Calibri" w:eastAsia="Calibri" w:hAnsi="Calibri"/>
-          <w:b w:val="false"/>
-          <w:bCs w:val="false"/>
-          <w:i w:val="false"/>
-          <w:iCs w:val="false"/>
-          <w:caps w:val="false"/>
-          <w:sz w:val="22"/>
-          <w:szCs w:val="22"/>
-        </w:rPr>
-        <w:t xml:space="preserve">” means the first equity financing after the Agreement Date in which the Company issues a new class or series of Preferred Stock for capital-raising purposes (the “</w:t>
-      </w:r>
-      <w:r>
-        <w:rPr>
-          <w:rFonts w:ascii="Calibri" w:cs="Calibri" w:eastAsia="Calibri" w:hAnsi="Calibri"/>
-          <w:b/>
-          <w:bCs/>
-          <w:i w:val="false"/>
-          <w:iCs w:val="false"/>
-          <w:caps w:val="false"/>
-          <w:sz w:val="22"/>
-          <w:szCs w:val="22"/>
-        </w:rPr>
-        <w:t xml:space="preserve">Next Financing Preferred</w:t>
-      </w:r>
-      <w:r>
-        <w:rPr>
-          <w:rFonts w:ascii="Calibri" w:cs="Calibri" w:eastAsia="Calibri" w:hAnsi="Calibri"/>
-          <w:b w:val="false"/>
-          <w:bCs w:val="false"/>
-          <w:i w:val="false"/>
-          <w:iCs w:val="false"/>
-          <w:caps w:val="false"/>
-          <w:sz w:val="22"/>
-          <w:szCs w:val="22"/>
-        </w:rPr>
-        <w:t xml:space="preserve">”). The “</w:t>
-      </w:r>
-      <w:r>
-        <w:rPr>
-          <w:rFonts w:ascii="Calibri" w:cs="Calibri" w:eastAsia="Calibri" w:hAnsi="Calibri"/>
-          <w:b/>
-          <w:bCs/>
-          <w:i w:val="false"/>
-          <w:iCs w:val="false"/>
-          <w:caps w:val="false"/>
-          <w:sz w:val="22"/>
-          <w:szCs w:val="22"/>
-        </w:rPr>
-        <w:t xml:space="preserve">Next Financing Documents</w:t>
-      </w:r>
-      <w:r>
-        <w:rPr>
-          <w:rFonts w:ascii="Calibri" w:cs="Calibri" w:eastAsia="Calibri" w:hAnsi="Calibri"/>
-          <w:b w:val="false"/>
-          <w:bCs w:val="false"/>
-          <w:i w:val="false"/>
-          <w:iCs w:val="false"/>
-          <w:caps w:val="false"/>
-          <w:sz w:val="22"/>
-          <w:szCs w:val="22"/>
-        </w:rPr>
-        <w:t xml:space="preserve">” means the Restated Certificate as amended in the Next Financing and the investors’ rights, voting, right of first refusal and co-sale, and other agreements, if any, signed by the investors in the Next Financing. “</w:t>
-      </w:r>
-      <w:r>
-        <w:rPr>
-          <w:rFonts w:ascii="Calibri" w:cs="Calibri" w:eastAsia="Calibri" w:hAnsi="Calibri"/>
-          <w:b/>
-          <w:bCs/>
-          <w:i w:val="false"/>
-          <w:iCs w:val="false"/>
-          <w:caps w:val="false"/>
-          <w:sz w:val="22"/>
-          <w:szCs w:val="22"/>
-        </w:rPr>
-        <w:t xml:space="preserve">Economic Terms</w:t>
-      </w:r>
-      <w:r>
-        <w:rPr>
-          <w:rFonts w:ascii="Calibri" w:cs="Calibri" w:eastAsia="Calibri" w:hAnsi="Calibri"/>
-          <w:b w:val="false"/>
-          <w:bCs w:val="false"/>
-          <w:i w:val="false"/>
-          <w:iCs w:val="false"/>
-          <w:caps w:val="false"/>
-          <w:sz w:val="22"/>
-          <w:szCs w:val="22"/>
-        </w:rPr>
-        <w:t xml:space="preserve">” means, as to any class or series of Preferred Stock, its original issue price, conversion price and conversion ratio, liquidation preference amount and seniority, whether and to what extent its liquidation preference is participating, the form of any price-based anti-dilution protection, dividend rate and whether dividends are cumulative, any pay-to-play provision, redemption price, and any other term expressed as or derived from a price, valuation or dollar amount.</w:t>
+          <w:rStyle w:val="FootnoteReference"/>
+        </w:rPr>
+        <w:footnoteReference w:id="11"/>
       </w:r>
     </w:p>
     <w:p>
@@ -6017,7 +6052,7 @@
           <w:sz w:val="22"/>
           <w:szCs w:val="22"/>
         </w:rPr>
-        <w:t xml:space="preserve">(b)</w:t>
+        <w:t xml:space="preserve">(a)</w:t>
       </w:r>
       <w:r>
         <w:rPr>
@@ -6035,7 +6070,7 @@
           <w:sz w:val="22"/>
           <w:szCs w:val="22"/>
         </w:rPr>
-        <w:t xml:space="preserve">Rights Granted to All Investors.</w:t>
+        <w:t xml:space="preserve">Definitions.</w:t>
       </w:r>
       <w:r>
         <w:rPr>
@@ -6056,7 +6091,111 @@
           <w:sz w:val="22"/>
           <w:szCs w:val="22"/>
         </w:rPr>
-        <w:t xml:space="preserve">If the Next Financing Documents grant rights to all purchasers of the Next Financing Preferred that are not granted to the Purchasers under this Agreement (including registration rights, rights of first refusal and co-sale with respect to transfers by Key Holders, information rights and participation rights, in each case to the extent not conditioned on an ownership or investment threshold), the Company shall grant each Purchaser the same rights, on the same terms, with respect to its Shares, by including the Purchasers as parties to the Next Financing Documents or by amending this Agreement.</w:t>
+        <w:t xml:space="preserve">The “</w:t>
+      </w:r>
+      <w:r>
+        <w:rPr>
+          <w:rFonts w:ascii="Calibri" w:cs="Calibri" w:eastAsia="Calibri" w:hAnsi="Calibri"/>
+          <w:b/>
+          <w:bCs/>
+          <w:i w:val="false"/>
+          <w:iCs w:val="false"/>
+          <w:caps w:val="false"/>
+          <w:sz w:val="22"/>
+          <w:szCs w:val="22"/>
+        </w:rPr>
+        <w:t xml:space="preserve">Next Financing</w:t>
+      </w:r>
+      <w:r>
+        <w:rPr>
+          <w:rFonts w:ascii="Calibri" w:cs="Calibri" w:eastAsia="Calibri" w:hAnsi="Calibri"/>
+          <w:b w:val="false"/>
+          <w:bCs w:val="false"/>
+          <w:i w:val="false"/>
+          <w:iCs w:val="false"/>
+          <w:caps w:val="false"/>
+          <w:sz w:val="22"/>
+          <w:szCs w:val="22"/>
+        </w:rPr>
+        <w:t xml:space="preserve">” means the first equity financing after the Agreement Date in which the Company issues a new class or series of Preferred Stock for capital-raising purposes (the “</w:t>
+      </w:r>
+      <w:r>
+        <w:rPr>
+          <w:rFonts w:ascii="Calibri" w:cs="Calibri" w:eastAsia="Calibri" w:hAnsi="Calibri"/>
+          <w:b/>
+          <w:bCs/>
+          <w:i w:val="false"/>
+          <w:iCs w:val="false"/>
+          <w:caps w:val="false"/>
+          <w:sz w:val="22"/>
+          <w:szCs w:val="22"/>
+        </w:rPr>
+        <w:t xml:space="preserve">Next Financing Preferred</w:t>
+      </w:r>
+      <w:r>
+        <w:rPr>
+          <w:rFonts w:ascii="Calibri" w:cs="Calibri" w:eastAsia="Calibri" w:hAnsi="Calibri"/>
+          <w:b w:val="false"/>
+          <w:bCs w:val="false"/>
+          <w:i w:val="false"/>
+          <w:iCs w:val="false"/>
+          <w:caps w:val="false"/>
+          <w:sz w:val="22"/>
+          <w:szCs w:val="22"/>
+        </w:rPr>
+        <w:t xml:space="preserve">”). The “</w:t>
+      </w:r>
+      <w:r>
+        <w:rPr>
+          <w:rFonts w:ascii="Calibri" w:cs="Calibri" w:eastAsia="Calibri" w:hAnsi="Calibri"/>
+          <w:b/>
+          <w:bCs/>
+          <w:i w:val="false"/>
+          <w:iCs w:val="false"/>
+          <w:caps w:val="false"/>
+          <w:sz w:val="22"/>
+          <w:szCs w:val="22"/>
+        </w:rPr>
+        <w:t xml:space="preserve">Next Financing Documents</w:t>
+      </w:r>
+      <w:r>
+        <w:rPr>
+          <w:rFonts w:ascii="Calibri" w:cs="Calibri" w:eastAsia="Calibri" w:hAnsi="Calibri"/>
+          <w:b w:val="false"/>
+          <w:bCs w:val="false"/>
+          <w:i w:val="false"/>
+          <w:iCs w:val="false"/>
+          <w:caps w:val="false"/>
+          <w:sz w:val="22"/>
+          <w:szCs w:val="22"/>
+        </w:rPr>
+        <w:t xml:space="preserve">” means the Restated Certificate as amended in the Next Financing and the investors’ rights, voting, right of first refusal and co-sale, and other agreements, if any, signed by the investors in the Next Financing. “</w:t>
+      </w:r>
+      <w:r>
+        <w:rPr>
+          <w:rFonts w:ascii="Calibri" w:cs="Calibri" w:eastAsia="Calibri" w:hAnsi="Calibri"/>
+          <w:b/>
+          <w:bCs/>
+          <w:i w:val="false"/>
+          <w:iCs w:val="false"/>
+          <w:caps w:val="false"/>
+          <w:sz w:val="22"/>
+          <w:szCs w:val="22"/>
+        </w:rPr>
+        <w:t xml:space="preserve">Economic Terms</w:t>
+      </w:r>
+      <w:r>
+        <w:rPr>
+          <w:rFonts w:ascii="Calibri" w:cs="Calibri" w:eastAsia="Calibri" w:hAnsi="Calibri"/>
+          <w:b w:val="false"/>
+          <w:bCs w:val="false"/>
+          <w:i w:val="false"/>
+          <w:iCs w:val="false"/>
+          <w:caps w:val="false"/>
+          <w:sz w:val="22"/>
+          <w:szCs w:val="22"/>
+        </w:rPr>
+        <w:t xml:space="preserve">” means, as to any class or series of Preferred Stock, its original issue price, conversion price and conversion ratio, liquidation preference amount and seniority, whether and to what extent its liquidation preference is participating, the form of any price-based anti-dilution protection, dividend rate and whether dividends are cumulative, any pay-to-play provision, redemption price, and any other term expressed as or derived from a price, valuation or dollar amount.</w:t>
       </w:r>
     </w:p>
     <w:p>
@@ -6073,7 +6212,7 @@
           <w:sz w:val="22"/>
           <w:szCs w:val="22"/>
         </w:rPr>
-        <w:t xml:space="preserve">(c)</w:t>
+        <w:t xml:space="preserve">(b)</w:t>
       </w:r>
       <w:r>
         <w:rPr>
@@ -6091,7 +6230,7 @@
           <w:sz w:val="22"/>
           <w:szCs w:val="22"/>
         </w:rPr>
-        <w:t xml:space="preserve">Threshold-Based Rights.</w:t>
+        <w:t xml:space="preserve">Rights Granted to All Investors.</w:t>
       </w:r>
       <w:r>
         <w:rPr>
@@ -6112,7 +6251,7 @@
           <w:sz w:val="22"/>
           <w:szCs w:val="22"/>
         </w:rPr>
-        <w:t xml:space="preserve">If any right under the Next Financing Documents is available only to holders that meet a share-ownership or investment-amount threshold (including rights granted to “Major Investors” or similarly defined holders), that right is available to a Purchaser only if the Purchaser meets the applicable threshold, but for that purpose (i) the Shares held by the Purchaser and its Affiliates count toward any share-based threshold on an as-converted basis, and (ii) the aggregate Purchase Price paid for the Shares held by the Purchaser and its Affiliates counts toward any dollar-based threshold. A Purchaser’s status as a Major Purchaser under this Agreement does not by itself entitle it to any threshold-based right under the Next Financing Documents.</w:t>
+        <w:t xml:space="preserve">If the Next Financing Documents grant rights to all purchasers of the Next Financing Preferred that are not granted to the Purchasers under this Agreement (including registration rights, rights of first refusal and co-sale with respect to transfers by Key Holders, information rights and participation rights, in each case to the extent not conditioned on an ownership or investment threshold), the Company shall grant each Purchaser the same rights, on the same terms, with respect to its Shares, by including the Purchasers as parties to the Next Financing Documents or by amending this Agreement.</w:t>
       </w:r>
     </w:p>
     <w:p>
@@ -6129,7 +6268,7 @@
           <w:sz w:val="22"/>
           <w:szCs w:val="22"/>
         </w:rPr>
-        <w:t xml:space="preserve">(d)</w:t>
+        <w:t xml:space="preserve">(c)</w:t>
       </w:r>
       <w:r>
         <w:rPr>
@@ -6147,7 +6286,7 @@
           <w:sz w:val="22"/>
           <w:szCs w:val="22"/>
         </w:rPr>
-        <w:t xml:space="preserve">Charter Rights.</w:t>
+        <w:t xml:space="preserve">Threshold-Based Rights.</w:t>
       </w:r>
       <w:r>
         <w:rPr>
@@ -6168,7 +6307,7 @@
           <w:sz w:val="22"/>
           <w:szCs w:val="22"/>
         </w:rPr>
-        <w:t xml:space="preserve">If the powers, preferences and special rights of the Next Financing Preferred under the Restated Certificate, other than its Economic Terms, are more favorable than those of the Series Seed Preferred Stock, the Company shall amend the Restated Certificate in the Next Financing so that the Series Seed Preferred Stock has substantially equivalent powers, preferences and special rights, adjusted to reflect its own Economic Terms. For this purpose, (i) the Series Seed Preferred Stock will exercise any approval or consent right of the Preferred Stock together with the Next Financing Preferred (and any other Preferred Stock) voting as a single class on an as-converted basis, and (ii) a separate class or series vote of the Next Financing Preferred, or a right to elect directors as a separate series, is not a right to which the Series Seed Preferred Stock is entitled under this Section 5.5.</w:t>
+        <w:t xml:space="preserve">If any right under the Next Financing Documents is available only to holders that meet a share-ownership or investment-amount threshold (including rights granted to “Major Investors” or similarly defined holders), that right is available to a Purchaser only if the Purchaser meets the applicable threshold, but for that purpose (i) the Shares held by the Purchaser and its Affiliates count toward any share-based threshold on an as-converted basis, and (ii) the aggregate Purchase Price paid for the Shares held by the Purchaser and its Affiliates counts toward any dollar-based threshold. A Purchaser’s status as a Major Purchaser under this Agreement does not by itself entitle it to any threshold-based right under the Next Financing Documents.</w:t>
       </w:r>
     </w:p>
     <w:p>
@@ -6185,7 +6324,7 @@
           <w:sz w:val="22"/>
           <w:szCs w:val="22"/>
         </w:rPr>
-        <w:t xml:space="preserve">(e)</w:t>
+        <w:t xml:space="preserve">(d)</w:t>
       </w:r>
       <w:r>
         <w:rPr>
@@ -6203,7 +6342,7 @@
           <w:sz w:val="22"/>
           <w:szCs w:val="22"/>
         </w:rPr>
-        <w:t xml:space="preserve">Exclusions.</w:t>
+        <w:t xml:space="preserve">Charter Rights.</w:t>
       </w:r>
       <w:r>
         <w:rPr>
@@ -6224,7 +6363,7 @@
           <w:sz w:val="22"/>
           <w:szCs w:val="22"/>
         </w:rPr>
-        <w:t xml:space="preserve">This Section 5.5 does not entitle any Purchaser to (i) the Economic Terms of the Next Financing Preferred; (ii) any right granted to an investor by name or under a side letter or similar agreement, including the right to designate a director or board observer, a management rights letter, or an investor-specific consent, information or participation right; or (iii) any right that terminated or was waived under this Agreement before the Next Financing.</w:t>
+        <w:t xml:space="preserve">If the powers, preferences and special rights of the Next Financing Preferred under the Restated Certificate, other than its Economic Terms, are more favorable than those of the Series Seed Preferred Stock, the Company shall amend the Restated Certificate in the Next Financing so that the Series Seed Preferred Stock has substantially equivalent powers, preferences and special rights, adjusted to reflect its own Economic Terms. For this purpose, (i) the Series Seed Preferred Stock will exercise any approval or consent right of the Preferred Stock together with the Next Financing Preferred (and any other Preferred Stock) voting as a single class on an as-converted basis, and (ii) a separate class or series vote of the Next Financing Preferred, or a right to elect directors as a separate series, is not a right to which the Series Seed Preferred Stock is entitled under this Section 5.5.</w:t>
       </w:r>
     </w:p>
     <w:p>
@@ -6241,6 +6380,62 @@
           <w:sz w:val="22"/>
           <w:szCs w:val="22"/>
         </w:rPr>
+        <w:t xml:space="preserve">(e)</w:t>
+      </w:r>
+      <w:r>
+        <w:rPr>
+          <w:rFonts w:ascii="Calibri" w:cs="Calibri" w:eastAsia="Calibri" w:hAnsi="Calibri"/>
+          <w:sz w:val="22"/>
+          <w:szCs w:val="22"/>
+        </w:rPr>
+        <w:t xml:space="preserve">	</w:t>
+      </w:r>
+      <w:r>
+        <w:rPr>
+          <w:rFonts w:ascii="Calibri" w:cs="Calibri" w:eastAsia="Calibri" w:hAnsi="Calibri"/>
+          <w:b/>
+          <w:bCs/>
+          <w:sz w:val="22"/>
+          <w:szCs w:val="22"/>
+        </w:rPr>
+        <w:t xml:space="preserve">Exclusions.</w:t>
+      </w:r>
+      <w:r>
+        <w:rPr>
+          <w:rFonts w:ascii="Calibri" w:cs="Calibri" w:eastAsia="Calibri" w:hAnsi="Calibri"/>
+          <w:sz w:val="22"/>
+          <w:szCs w:val="22"/>
+        </w:rPr>
+        <w:t xml:space="preserve"> </w:t>
+      </w:r>
+      <w:r>
+        <w:rPr>
+          <w:rFonts w:ascii="Calibri" w:cs="Calibri" w:eastAsia="Calibri" w:hAnsi="Calibri"/>
+          <w:b w:val="false"/>
+          <w:bCs w:val="false"/>
+          <w:i w:val="false"/>
+          <w:iCs w:val="false"/>
+          <w:caps w:val="false"/>
+          <w:sz w:val="22"/>
+          <w:szCs w:val="22"/>
+        </w:rPr>
+        <w:t xml:space="preserve">This Section 5.5 does not entitle any Purchaser to (i) the Economic Terms of the Next Financing Preferred; (ii) any right granted to an investor by name or under a side letter or similar agreement, including the right to designate a director or board observer, a management rights letter, or an investor-specific consent, information or participation right; or (iii) any right that terminated or was waived under this Agreement before the Next Financing.</w:t>
+      </w:r>
+    </w:p>
+    <w:p>
+      <w:pPr>
+        <w:tabs>
+          <w:tab w:val="left" w:pos="1440"/>
+        </w:tabs>
+        <w:spacing w:after="200" w:before="0"/>
+        <w:ind w:left="0" w:firstLine="720"/>
+      </w:pPr>
+      <w:r>
+        <w:rPr>
+          <w:rFonts w:ascii="Calibri" w:cs="Calibri" w:eastAsia="Calibri" w:hAnsi="Calibri"/>
+          <w:sz w:val="22"/>
+          <w:szCs w:val="22"/>
+        </w:rPr>
         <w:t xml:space="preserve">(f)</w:t>
       </w:r>
       <w:r>
@@ -9197,7 +9392,7 @@
           <w:sz w:val="22"/>
           <w:szCs w:val="22"/>
         </w:rPr>
-        <w:t xml:space="preserve">Any term of this Agreement may be amended, terminated or waived (either generally or in a particular instance, and either retroactively or prospectively) only with the written consent of the Company and the Requisite Purchasers; except that (a) Sections 7.2(a), 7.2(c) and 7.5(a)(ii), and any other provision of this Agreement that would be amended, terminated or waived in a manner that adversely affects the Key Holders disproportionately to the Purchasers, may be amended, terminated or waived only with the additional written consent of Qualified Key Holders holding a majority of the shares of Common Stock then held by all Qualified Key Holders; (b) no amendment, termination or waiver that applies to a Purchaser in a manner adversely different from the other Purchasers is effective against that Purchaser without its written consent; (c) any provision may be waived by the party entitled to its benefit on that party’s own behalf; and (d) the Company may update </w:t>
+        <w:t xml:space="preserve">Any term of this Agreement may be amended, terminated or waived (either generally or in a particular instance, and either retroactively or prospectively) only with the written consent of the Company and the Requisite Purchasers; except that (a) Sections 7.2(a), 7.2(c) and 7.5(a)(ii), and any other provision of this Agreement that would be amended, terminated or waived in a manner that adversely affects the Key Holders disproportionately to the Purchasers, may be amended, terminated or waived only with the additional written consent of Qualified Key Holders holding a majority of the shares of Common Stock then held by all Qualified Key Holders; (b) no amendment, termination or waiver that applies to a Purchaser in a manner adversely different from the other Purchasers is effective against that Purchaser without its written consent, except that a waiver of Section 5.4 for a particular offering of New Securities applies to the Major Purchasers in the same manner if each Major Purchaser that then holds rights under Section 5.4 and did not consent to the waiver is offered the opportunity to purchase, on the same terms as the other Major Purchasers, at least the same proportion of its Pro Rata Share as any other Major Purchaser purchases in that offering; (c) any provision may be waived by the party entitled to its benefit on that party’s own behalf; and (d) the Company may update </w:t>
       </w:r>
       <w:r>
         <w:rPr>
@@ -12534,7 +12729,7 @@
           <w:sz w:val="20"/>
           <w:szCs w:val="20"/>
         </w:rPr>
-        <w:t xml:space="preserve">Section 5.4 is the NVCA model’s right of first offer, condensed. It is limited to Major Purchasers and carries the overallotment right in Section 5.4(c).</w:t>
+        <w:t xml:space="preserve">Section 5.4 is the NVCA model’s right of first offer, condensed. It is limited to Major Purchasers and carries the overallotment right in Section 5.4(c). Sections 5.4(e) and 5.4(f) are optional alternatives; keep one or neither. Alternative 1 is a pay-to-play provision that reaches only the participation right: a Major Purchaser that does not buy its required share of a Qualified Financing loses the right for later rounds, including any participation right that Section 5.5 would otherwise carry into the next round’s documents, and keeps everything else. It is narrower than the NVCA model charter’s Special Mandatory Conversion, which converts some or all of a holder’s Preferred Stock to Common Stock if the holder does not buy its full pro rata amount; that is a feature of the stock, belongs in the charter, and is left out of this form. Because the Qualified Financing will usually be the Next Financing, the forfeiture matters mainly for what the next round’s documents give the holder, and the next-round investors remain free to grant a participation right on their own terms. If Alternative 1 is used, choose the full-share or percentage trigger and match it in the Term Sheet, decide whether a round led by existing holders counts, and fill in the Qualified Financing Threshold in Section 1.1; if it is not used, delete it and the Qualified Financing Threshold row. Alternative 2 follows the one-round pattern of the Y Combinator pro rata side letter: the right covers every issuance through the next preferred stock financing and ends there, and later participation rights are whatever the next round’s documents provide. Without either alternative, the right continues until this Agreement terminates under Section 5.5(f), and Section 5.5(b) and (c) carry a participation right into the next round. Section 8.9(b) lets the Requisite Purchasers waive Section 5.4 for a particular round if every Major Purchaser is offered the same proportion of its share as any other Major Purchaser buys.</w:t>
       </w:r>
     </w:p>
   </w:footnote>

</xml_diff>